<commit_message>
Record the commercial validation assets
IP_COMMERCIALIZATION_TRACKER to rev 3 with the operational assets and
the prices the owner set. Nothing sent, used or posted yet.

Co-Authored-By: Claude Opus 5 <noreply@anthropic.com>
Claude-Session: https://claude.ai/code/session_01W9UtE7X76spacWeSvBH7tv
</commit_message>
<xml_diff>
--- a/IP_COMMERCIALIZATION_TRACKER.docx
+++ b/IP_COMMERCIALIZATION_TRACKER.docx
@@ -122,7 +122,7 @@
               <w:spacing w:after="0"/>
             </w:pPr>
             <w:r>
-              <w:t xml:space="preserve">2026-08-13 (rev 2)</w:t>
+              <w:t xml:space="preserve">2026-08-13 (rev 3)</w:t>
             </w:r>
           </w:p>
         </w:tc>
@@ -153,7 +153,7 @@
               <w:spacing w:after="0"/>
             </w:pPr>
             <w:r>
-              <w:t xml:space="preserve">2</w:t>
+              <w:t xml:space="preserve">3</w:t>
             </w:r>
           </w:p>
         </w:tc>
@@ -998,10 +998,10 @@
               <w:rPr>
                 <w:b/>
               </w:rPr>
-              <w:t xml:space="preserve">`[REQUIRES USER INPUT]`.</w:t>
-            </w:r>
-            <w:r>
-              <w:t xml:space="preserve"> Free is defensible here: it is the door opener</w:t>
+              <w:t xml:space="preserve">Free.</w:t>
+            </w:r>
+            <w:r>
+              <w:t xml:space="preserve"> It is the door opener and stays ungated</w:t>
             </w:r>
           </w:p>
         </w:tc>
@@ -1379,7 +1379,10 @@
               <w:rPr>
                 <w:b/>
               </w:rPr>
-              <w:t xml:space="preserve">`[REQUIRES USER INPUT]`</w:t>
+              <w:t xml:space="preserve">$500 to $1,000</w:t>
+            </w:r>
+            <w:r>
+              <w:t xml:space="preserve">, set by the owner 2026-08-13</w:t>
             </w:r>
           </w:p>
         </w:tc>
@@ -1410,7 +1413,7 @@
               <w:spacing w:after="0"/>
             </w:pPr>
             <w:r>
-              <w:t xml:space="preserve">Pricing, and a payment mechanism if it is not free</w:t>
+              <w:t xml:space="preserve">A payment mechanism. Scoping is by email until one exists</w:t>
             </w:r>
           </w:p>
         </w:tc>
@@ -1773,7 +1776,10 @@
               <w:rPr>
                 <w:b/>
               </w:rPr>
-              <w:t xml:space="preserve">`[REQUIRES USER INPUT]`</w:t>
+              <w:t xml:space="preserve">$750 to $1,500</w:t>
+            </w:r>
+            <w:r>
+              <w:t xml:space="preserve">, set by the owner 2026-08-13</w:t>
             </w:r>
           </w:p>
         </w:tc>
@@ -1804,7 +1810,7 @@
               <w:spacing w:after="0"/>
             </w:pPr>
             <w:r>
-              <w:t xml:space="preserve">Licence terms, scoring workflow, pricing, payment mechanism</w:t>
+              <w:t xml:space="preserve">Licence terms, scoring workflow, payment mechanism</w:t>
             </w:r>
           </w:p>
         </w:tc>
@@ -2793,6 +2799,458 @@
         <w:spacing w:after="140"/>
       </w:pPr>
       <w:r>
+        <w:t xml:space="preserve">3d. OPERATIONAL ASSETS (rev 3)</w:t>
+      </w:r>
+    </w:p>
+    <w:p>
+      <w:pPr>
+        <w:spacing w:after="140"/>
+      </w:pPr>
+      <w:r>
+        <w:t xml:space="preserve">Built 2026-08-13. </w:t>
+      </w:r>
+      <w:r>
+        <w:rPr>
+          <w:b/>
+        </w:rPr>
+        <w:t xml:space="preserve">These are the things that had to exist before a single offer could be made.</w:t>
+      </w:r>
+    </w:p>
+    <w:tbl>
+      <w:tblPr>
+        <w:tblStyle w:val="TableGrid"/>
+        <w:tblW w:w="9360" w:type="dxa"/>
+        <w:tblBorders>
+          <w:top w:val="single" w:sz="4" w:space="0" w:color="999999"/>
+          <w:left w:val="single" w:sz="4" w:space="0" w:color="999999"/>
+          <w:bottom w:val="single" w:sz="4" w:space="0" w:color="999999"/>
+          <w:right w:val="single" w:sz="4" w:space="0" w:color="999999"/>
+          <w:insideH w:val="single" w:sz="4" w:space="0" w:color="999999"/>
+          <w:insideV w:val="single" w:sz="4" w:space="0" w:color="999999"/>
+        </w:tblBorders>
+      </w:tblPr>
+      <w:tblGrid>
+        <w:gridCol w:w="3120"/>
+        <w:gridCol w:w="3120"/>
+        <w:gridCol w:w="3120"/>
+      </w:tblGrid>
+      <w:tr>
+        <w:tc>
+          <w:tcPr>
+            <w:tcW w:w="3120" w:type="dxa"/>
+          </w:tcPr>
+          <w:p>
+            <w:pPr>
+              <w:spacing w:after="0"/>
+            </w:pPr>
+            <w:r>
+              <w:t xml:space="preserve">Asset</w:t>
+            </w:r>
+          </w:p>
+        </w:tc>
+        <w:tc>
+          <w:tcPr>
+            <w:tcW w:w="3120" w:type="dxa"/>
+          </w:tcPr>
+          <w:p>
+            <w:pPr>
+              <w:spacing w:after="0"/>
+            </w:pPr>
+            <w:r>
+              <w:t xml:space="preserve">Path</w:t>
+            </w:r>
+          </w:p>
+        </w:tc>
+        <w:tc>
+          <w:tcPr>
+            <w:tcW w:w="3120" w:type="dxa"/>
+          </w:tcPr>
+          <w:p>
+            <w:pPr>
+              <w:spacing w:after="0"/>
+            </w:pPr>
+            <w:r>
+              <w:t xml:space="preserve">State</w:t>
+            </w:r>
+          </w:p>
+        </w:tc>
+      </w:tr>
+      <w:tr>
+        <w:tc>
+          <w:tcPr>
+            <w:tcW w:w="3120" w:type="dxa"/>
+          </w:tcPr>
+          <w:p>
+            <w:pPr>
+              <w:spacing w:after="0"/>
+            </w:pPr>
+            <w:r>
+              <w:t xml:space="preserve">Offer 1 intake</w:t>
+            </w:r>
+          </w:p>
+        </w:tc>
+        <w:tc>
+          <w:tcPr>
+            <w:tcW w:w="3120" w:type="dxa"/>
+          </w:tcPr>
+          <w:p>
+            <w:pPr>
+              <w:spacing w:after="0"/>
+            </w:pPr>
+            <w:r>
+              <w:rPr>
+                <w:rFonts w:ascii="Consolas" w:hAnsi="Consolas"/>
+              </w:rPr>
+              <w:t xml:space="preserve">audit-request.html</w:t>
+            </w:r>
+          </w:p>
+        </w:tc>
+        <w:tc>
+          <w:tcPr>
+            <w:tcW w:w="3120" w:type="dxa"/>
+          </w:tcPr>
+          <w:p>
+            <w:pPr>
+              <w:spacing w:after="0"/>
+            </w:pPr>
+            <w:r>
+              <w:rPr>
+                <w:b/>
+              </w:rPr>
+              <w:t xml:space="preserve">LIVE.</w:t>
+            </w:r>
+            <w:r>
+              <w:t xml:space="preserve"> $250 to $500</w:t>
+            </w:r>
+          </w:p>
+        </w:tc>
+      </w:tr>
+      <w:tr>
+        <w:tc>
+          <w:tcPr>
+            <w:tcW w:w="3120" w:type="dxa"/>
+          </w:tcPr>
+          <w:p>
+            <w:pPr>
+              <w:spacing w:after="0"/>
+            </w:pPr>
+            <w:r>
+              <w:t xml:space="preserve">Offer 2 intake</w:t>
+            </w:r>
+          </w:p>
+        </w:tc>
+        <w:tc>
+          <w:tcPr>
+            <w:tcW w:w="3120" w:type="dxa"/>
+          </w:tcPr>
+          <w:p>
+            <w:pPr>
+              <w:spacing w:after="0"/>
+            </w:pPr>
+            <w:r>
+              <w:rPr>
+                <w:rFonts w:ascii="Consolas" w:hAnsi="Consolas"/>
+              </w:rPr>
+              <w:t xml:space="preserve">governance-request.html</w:t>
+            </w:r>
+          </w:p>
+        </w:tc>
+        <w:tc>
+          <w:tcPr>
+            <w:tcW w:w="3120" w:type="dxa"/>
+          </w:tcPr>
+          <w:p>
+            <w:pPr>
+              <w:spacing w:after="0"/>
+            </w:pPr>
+            <w:r>
+              <w:rPr>
+                <w:b/>
+              </w:rPr>
+              <w:t xml:space="preserve">LIVE.</w:t>
+            </w:r>
+            <w:r>
+              <w:t xml:space="preserve"> $500 to $1,000</w:t>
+            </w:r>
+          </w:p>
+        </w:tc>
+      </w:tr>
+      <w:tr>
+        <w:tc>
+          <w:tcPr>
+            <w:tcW w:w="3120" w:type="dxa"/>
+          </w:tcPr>
+          <w:p>
+            <w:pPr>
+              <w:spacing w:after="0"/>
+            </w:pPr>
+            <w:r>
+              <w:t xml:space="preserve">Offer 3 intake</w:t>
+            </w:r>
+          </w:p>
+        </w:tc>
+        <w:tc>
+          <w:tcPr>
+            <w:tcW w:w="3120" w:type="dxa"/>
+          </w:tcPr>
+          <w:p>
+            <w:pPr>
+              <w:spacing w:after="0"/>
+            </w:pPr>
+            <w:r>
+              <w:rPr>
+                <w:rFonts w:ascii="Consolas" w:hAnsi="Consolas"/>
+              </w:rPr>
+              <w:t xml:space="preserve">calibration-request.html</w:t>
+            </w:r>
+          </w:p>
+        </w:tc>
+        <w:tc>
+          <w:tcPr>
+            <w:tcW w:w="3120" w:type="dxa"/>
+          </w:tcPr>
+          <w:p>
+            <w:pPr>
+              <w:spacing w:after="0"/>
+            </w:pPr>
+            <w:r>
+              <w:rPr>
+                <w:b/>
+              </w:rPr>
+              <w:t xml:space="preserve">LIVE.</w:t>
+            </w:r>
+            <w:r>
+              <w:t xml:space="preserve"> $750 to $1,500</w:t>
+            </w:r>
+          </w:p>
+        </w:tc>
+      </w:tr>
+      <w:tr>
+        <w:tc>
+          <w:tcPr>
+            <w:tcW w:w="3120" w:type="dxa"/>
+          </w:tcPr>
+          <w:p>
+            <w:pPr>
+              <w:spacing w:after="0"/>
+            </w:pPr>
+            <w:r>
+              <w:t xml:space="preserve">Proposal scripts</w:t>
+            </w:r>
+          </w:p>
+        </w:tc>
+        <w:tc>
+          <w:tcPr>
+            <w:tcW w:w="3120" w:type="dxa"/>
+          </w:tcPr>
+          <w:p>
+            <w:pPr>
+              <w:spacing w:after="0"/>
+            </w:pPr>
+            <w:r>
+              <w:rPr>
+                <w:rFonts w:ascii="Consolas" w:hAnsi="Consolas"/>
+              </w:rPr>
+              <w:t xml:space="preserve">UPWORK_PROPOSAL_TEMPLATES.md</w:t>
+            </w:r>
+          </w:p>
+        </w:tc>
+        <w:tc>
+          <w:tcPr>
+            <w:tcW w:w="3120" w:type="dxa"/>
+          </w:tcPr>
+          <w:p>
+            <w:pPr>
+              <w:spacing w:after="0"/>
+            </w:pPr>
+            <w:r>
+              <w:t xml:space="preserve">Written, </w:t>
+            </w:r>
+            <w:r>
+              <w:rPr>
+                <w:b/>
+              </w:rPr>
+              <w:t xml:space="preserve">0 sent</w:t>
+            </w:r>
+          </w:p>
+        </w:tc>
+      </w:tr>
+      <w:tr>
+        <w:tc>
+          <w:tcPr>
+            <w:tcW w:w="3120" w:type="dxa"/>
+          </w:tcPr>
+          <w:p>
+            <w:pPr>
+              <w:spacing w:after="0"/>
+            </w:pPr>
+            <w:r>
+              <w:t xml:space="preserve">Deliverable template</w:t>
+            </w:r>
+          </w:p>
+        </w:tc>
+        <w:tc>
+          <w:tcPr>
+            <w:tcW w:w="3120" w:type="dxa"/>
+          </w:tcPr>
+          <w:p>
+            <w:pPr>
+              <w:spacing w:after="0"/>
+            </w:pPr>
+            <w:r>
+              <w:rPr>
+                <w:rFonts w:ascii="Consolas" w:hAnsi="Consolas"/>
+              </w:rPr>
+              <w:t xml:space="preserve">templates/DIAGNOSTIC_REPORT_TEMPLATE.md</w:t>
+            </w:r>
+          </w:p>
+        </w:tc>
+        <w:tc>
+          <w:tcPr>
+            <w:tcW w:w="3120" w:type="dxa"/>
+          </w:tcPr>
+          <w:p>
+            <w:pPr>
+              <w:spacing w:after="0"/>
+            </w:pPr>
+            <w:r>
+              <w:t xml:space="preserve">Written, </w:t>
+            </w:r>
+            <w:r>
+              <w:rPr>
+                <w:b/>
+              </w:rPr>
+              <w:t xml:space="preserve">0 used</w:t>
+            </w:r>
+          </w:p>
+        </w:tc>
+      </w:tr>
+      <w:tr>
+        <w:tc>
+          <w:tcPr>
+            <w:tcW w:w="3120" w:type="dxa"/>
+          </w:tcPr>
+          <w:p>
+            <w:pPr>
+              <w:spacing w:after="0"/>
+            </w:pPr>
+            <w:r>
+              <w:t xml:space="preserve">Launch posts</w:t>
+            </w:r>
+          </w:p>
+        </w:tc>
+        <w:tc>
+          <w:tcPr>
+            <w:tcW w:w="3120" w:type="dxa"/>
+          </w:tcPr>
+          <w:p>
+            <w:pPr>
+              <w:spacing w:after="0"/>
+            </w:pPr>
+            <w:r>
+              <w:rPr>
+                <w:rFonts w:ascii="Consolas" w:hAnsi="Consolas"/>
+              </w:rPr>
+              <w:t xml:space="preserve">LINKEDIN_LAUNCH_POSTS.md</w:t>
+            </w:r>
+          </w:p>
+        </w:tc>
+        <w:tc>
+          <w:tcPr>
+            <w:tcW w:w="3120" w:type="dxa"/>
+          </w:tcPr>
+          <w:p>
+            <w:pPr>
+              <w:spacing w:after="0"/>
+            </w:pPr>
+            <w:r>
+              <w:t xml:space="preserve">Written, </w:t>
+            </w:r>
+            <w:r>
+              <w:rPr>
+                <w:b/>
+              </w:rPr>
+              <w:t xml:space="preserve">0 posted</w:t>
+            </w:r>
+          </w:p>
+        </w:tc>
+      </w:tr>
+    </w:tbl>
+    <w:p>
+      <w:pPr/>
+      <w:r>
+        <w:t/>
+      </w:r>
+    </w:p>
+    <w:p>
+      <w:pPr>
+        <w:spacing w:after="140"/>
+      </w:pPr>
+      <w:r>
+        <w:rPr>
+          <w:b/>
+        </w:rPr>
+        <w:t xml:space="preserve">The Data Isolation Guarantee</w:t>
+      </w:r>
+      <w:r>
+        <w:t xml:space="preserve"> appears on all three intake pages, generated from one string so the wording cannot drift between them, and verified identical after generation.</w:t>
+      </w:r>
+    </w:p>
+    <w:p>
+      <w:pPr>
+        <w:spacing w:after="140"/>
+      </w:pPr>
+      <w:r>
+        <w:rPr>
+          <w:b/>
+        </w:rPr>
+        <w:t xml:space="preserve">It is true because of what the pages do not contain.</w:t>
+      </w:r>
+      <w:r>
+        <w:t xml:space="preserve"> There is no form and no file input anywhere on them. Nothing on those pages could store a record even by accident. Scope is agreed by email before anything is sent.</w:t>
+      </w:r>
+    </w:p>
+    <w:p>
+      <w:pPr>
+        <w:spacing w:after="140"/>
+      </w:pPr>
+      <w:r>
+        <w:rPr>
+          <w:b/>
+        </w:rPr>
+        <w:t xml:space="preserve">Prices are now set.</w:t>
+      </w:r>
+      <w:r>
+        <w:t xml:space="preserve"> Open items 2 and 4 of section 6 close on the offer pricing; the payment mechanism is still absent, which is the standing blocker.</w:t>
+      </w:r>
+    </w:p>
+    <w:p>
+      <w:pPr>
+        <w:spacing w:after="140"/>
+      </w:pPr>
+      <w:r>
+        <w:rPr>
+          <w:b/>
+        </w:rPr>
+        <w:t xml:space="preserve">Nothing has been sent, used or posted.</w:t>
+      </w:r>
+      <w:r>
+        <w:t xml:space="preserve"> That is the honest state, and the first entry that changes it will be a real change.</w:t>
+      </w:r>
+    </w:p>
+    <w:p>
+      <w:pPr>
+        <w:pBdr>
+          <w:bottom w:val="single" w:sz="6" w:space="1" w:color="AAAAAA"/>
+        </w:pBdr>
+      </w:pPr>
+    </w:p>
+    <w:p>
+      <w:pPr>
+        <w:pStyle w:val="Heading2"/>
+        <w:spacing w:after="140"/>
+      </w:pPr>
+      <w:r>
         <w:t xml:space="preserve">4. LIVE BASELINE, THE NUMBERS EVERY PACKAGE INHERITS</w:t>
       </w:r>
     </w:p>
@@ -4091,6 +4549,71 @@
             </w:pPr>
             <w:r>
               <w:t xml:space="preserve">Change</w:t>
+            </w:r>
+          </w:p>
+        </w:tc>
+      </w:tr>
+      <w:tr>
+        <w:tc>
+          <w:tcPr>
+            <w:tcW w:w="3120" w:type="dxa"/>
+          </w:tcPr>
+          <w:p>
+            <w:pPr>
+              <w:spacing w:after="0"/>
+            </w:pPr>
+            <w:r>
+              <w:t xml:space="preserve">3</w:t>
+            </w:r>
+          </w:p>
+        </w:tc>
+        <w:tc>
+          <w:tcPr>
+            <w:tcW w:w="3120" w:type="dxa"/>
+          </w:tcPr>
+          <w:p>
+            <w:pPr>
+              <w:spacing w:after="0"/>
+            </w:pPr>
+            <w:r>
+              <w:t xml:space="preserve">2026-08-13</w:t>
+            </w:r>
+          </w:p>
+        </w:tc>
+        <w:tc>
+          <w:tcPr>
+            <w:tcW w:w="3120" w:type="dxa"/>
+          </w:tcPr>
+          <w:p>
+            <w:pPr>
+              <w:spacing w:after="0"/>
+            </w:pPr>
+            <w:r>
+              <w:rPr>
+                <w:b/>
+              </w:rPr>
+              <w:t xml:space="preserve">Operational assets built</w:t>
+            </w:r>
+            <w:r>
+              <w:t xml:space="preserve">, new section 3d: three offer intake pages live with a Data Isolation Guarantee generated from one source, three Upwork proposal scripts, a four-section diagnostic report template, and five LinkedIn launch posts. </w:t>
+            </w:r>
+            <w:r>
+              <w:rPr>
+                <w:b/>
+              </w:rPr>
+              <w:t xml:space="preserve">Prices set by the owner</w:t>
+            </w:r>
+            <w:r>
+              <w:t xml:space="preserve">: Offer 1 free at the door, Offer 2 $500 to $1,000, Offer 3 $750 to $1,500. The guarantee is true because the pages carry no form and no file input at all. </w:t>
+            </w:r>
+            <w:r>
+              <w:rPr>
+                <w:b/>
+              </w:rPr>
+              <w:t xml:space="preserve">Nothing sent, used or posted yet, and no package has moved off NOT STARTED.</w:t>
+            </w:r>
+            <w:r>
+              <w:t xml:space="preserve"> Payment mechanism remains the standing blocker.</w:t>
             </w:r>
           </w:p>
         </w:tc>

</xml_diff>

<commit_message>
Record the payment path and the three corrected premises
IP_COMMERCIALIZATION_TRACKER to rev 4, packages moved to LIVE meaning
reachable rather than sold. Revenue remains $0.

Co-Authored-By: Claude Opus 5 <noreply@anthropic.com>
Claude-Session: https://claude.ai/code/session_01W9UtE7X76spacWeSvBH7tv
</commit_message>
<xml_diff>
--- a/IP_COMMERCIALIZATION_TRACKER.docx
+++ b/IP_COMMERCIALIZATION_TRACKER.docx
@@ -122,7 +122,7 @@
               <w:spacing w:after="0"/>
             </w:pPr>
             <w:r>
-              <w:t xml:space="preserve">2026-08-13 (rev 3)</w:t>
+              <w:t xml:space="preserve">2026-08-13 (rev 4)</w:t>
             </w:r>
           </w:p>
         </w:tc>
@@ -153,7 +153,7 @@
               <w:spacing w:after="0"/>
             </w:pPr>
             <w:r>
-              <w:t xml:space="preserve">3</w:t>
+              <w:t xml:space="preserve">4</w:t>
             </w:r>
           </w:p>
         </w:tc>
@@ -482,7 +482,13 @@
               <w:spacing w:after="0"/>
             </w:pPr>
             <w:r>
-              <w:t xml:space="preserve">Seven-Point Record Defensibility Check</w:t>
+              <w:t xml:space="preserve">Seven-Point Check (free) + 5-record audit, </w:t>
+            </w:r>
+            <w:r>
+              <w:rPr>
+                <w:b/>
+              </w:rPr>
+              <w:t xml:space="preserve">$250</w:t>
             </w:r>
           </w:p>
         </w:tc>
@@ -498,6 +504,35 @@
               <w:rPr>
                 <w:b/>
               </w:rPr>
+              <w:t xml:space="preserve">Yes</w:t>
+            </w:r>
+          </w:p>
+        </w:tc>
+        <w:tc>
+          <w:tcPr>
+            <w:tcW w:w="1560" w:type="dxa"/>
+          </w:tcPr>
+          <w:p>
+            <w:pPr>
+              <w:spacing w:after="0"/>
+            </w:pPr>
+            <w:r>
+              <w:rPr>
+                <w:b/>
+              </w:rPr>
+              <w:t xml:space="preserve">LIVE</w:t>
+            </w:r>
+          </w:p>
+        </w:tc>
+        <w:tc>
+          <w:tcPr>
+            <w:tcW w:w="1560" w:type="dxa"/>
+          </w:tcPr>
+          <w:p>
+            <w:pPr>
+              <w:spacing w:after="0"/>
+            </w:pPr>
+            <w:r>
               <w:t xml:space="preserve">No</w:t>
             </w:r>
           </w:p>
@@ -511,6 +546,85 @@
               <w:spacing w:after="0"/>
             </w:pPr>
             <w:r>
+              <w:t xml:space="preserve">$0</w:t>
+            </w:r>
+          </w:p>
+        </w:tc>
+      </w:tr>
+      <w:tr>
+        <w:tc>
+          <w:tcPr>
+            <w:tcW w:w="1560" w:type="dxa"/>
+          </w:tcPr>
+          <w:p>
+            <w:pPr>
+              <w:spacing w:after="0"/>
+            </w:pPr>
+            <w:r>
+              <w:t xml:space="preserve">2</w:t>
+            </w:r>
+          </w:p>
+        </w:tc>
+        <w:tc>
+          <w:tcPr>
+            <w:tcW w:w="1560" w:type="dxa"/>
+          </w:tcPr>
+          <w:p>
+            <w:pPr>
+              <w:spacing w:after="0"/>
+            </w:pPr>
+            <w:r>
+              <w:t xml:space="preserve">Governance Documentation Review, </w:t>
+            </w:r>
+            <w:r>
+              <w:rPr>
+                <w:b/>
+              </w:rPr>
+              <w:t xml:space="preserve">$500</w:t>
+            </w:r>
+          </w:p>
+        </w:tc>
+        <w:tc>
+          <w:tcPr>
+            <w:tcW w:w="1560" w:type="dxa"/>
+          </w:tcPr>
+          <w:p>
+            <w:pPr>
+              <w:spacing w:after="0"/>
+            </w:pPr>
+            <w:r>
+              <w:rPr>
+                <w:b/>
+              </w:rPr>
+              <w:t xml:space="preserve">Yes</w:t>
+            </w:r>
+          </w:p>
+        </w:tc>
+        <w:tc>
+          <w:tcPr>
+            <w:tcW w:w="1560" w:type="dxa"/>
+          </w:tcPr>
+          <w:p>
+            <w:pPr>
+              <w:spacing w:after="0"/>
+            </w:pPr>
+            <w:r>
+              <w:rPr>
+                <w:b/>
+              </w:rPr>
+              <w:t xml:space="preserve">LIVE</w:t>
+            </w:r>
+          </w:p>
+        </w:tc>
+        <w:tc>
+          <w:tcPr>
+            <w:tcW w:w="1560" w:type="dxa"/>
+          </w:tcPr>
+          <w:p>
+            <w:pPr>
+              <w:spacing w:after="0"/>
+            </w:pPr>
+            <w:r>
               <w:t xml:space="preserve">No</w:t>
             </w:r>
           </w:p>
@@ -524,6 +638,85 @@
               <w:spacing w:after="0"/>
             </w:pPr>
             <w:r>
+              <w:t xml:space="preserve">$0</w:t>
+            </w:r>
+          </w:p>
+        </w:tc>
+      </w:tr>
+      <w:tr>
+        <w:tc>
+          <w:tcPr>
+            <w:tcW w:w="1560" w:type="dxa"/>
+          </w:tcPr>
+          <w:p>
+            <w:pPr>
+              <w:spacing w:after="0"/>
+            </w:pPr>
+            <w:r>
+              <w:t xml:space="preserve">3</w:t>
+            </w:r>
+          </w:p>
+        </w:tc>
+        <w:tc>
+          <w:tcPr>
+            <w:tcW w:w="1560" w:type="dxa"/>
+          </w:tcPr>
+          <w:p>
+            <w:pPr>
+              <w:spacing w:after="0"/>
+            </w:pPr>
+            <w:r>
+              <w:t xml:space="preserve">Benchmark Access and Calibration, </w:t>
+            </w:r>
+            <w:r>
+              <w:rPr>
+                <w:b/>
+              </w:rPr>
+              <w:t xml:space="preserve">$750</w:t>
+            </w:r>
+          </w:p>
+        </w:tc>
+        <w:tc>
+          <w:tcPr>
+            <w:tcW w:w="1560" w:type="dxa"/>
+          </w:tcPr>
+          <w:p>
+            <w:pPr>
+              <w:spacing w:after="0"/>
+            </w:pPr>
+            <w:r>
+              <w:rPr>
+                <w:b/>
+              </w:rPr>
+              <w:t xml:space="preserve">Yes</w:t>
+            </w:r>
+          </w:p>
+        </w:tc>
+        <w:tc>
+          <w:tcPr>
+            <w:tcW w:w="1560" w:type="dxa"/>
+          </w:tcPr>
+          <w:p>
+            <w:pPr>
+              <w:spacing w:after="0"/>
+            </w:pPr>
+            <w:r>
+              <w:rPr>
+                <w:b/>
+              </w:rPr>
+              <w:t xml:space="preserve">LIVE</w:t>
+            </w:r>
+          </w:p>
+        </w:tc>
+        <w:tc>
+          <w:tcPr>
+            <w:tcW w:w="1560" w:type="dxa"/>
+          </w:tcPr>
+          <w:p>
+            <w:pPr>
+              <w:spacing w:after="0"/>
+            </w:pPr>
+            <w:r>
               <w:t xml:space="preserve">No</w:t>
             </w:r>
           </w:p>
@@ -542,172 +735,6 @@
           </w:p>
         </w:tc>
       </w:tr>
-      <w:tr>
-        <w:tc>
-          <w:tcPr>
-            <w:tcW w:w="1560" w:type="dxa"/>
-          </w:tcPr>
-          <w:p>
-            <w:pPr>
-              <w:spacing w:after="0"/>
-            </w:pPr>
-            <w:r>
-              <w:t xml:space="preserve">2</w:t>
-            </w:r>
-          </w:p>
-        </w:tc>
-        <w:tc>
-          <w:tcPr>
-            <w:tcW w:w="1560" w:type="dxa"/>
-          </w:tcPr>
-          <w:p>
-            <w:pPr>
-              <w:spacing w:after="0"/>
-            </w:pPr>
-            <w:r>
-              <w:t xml:space="preserve">Model-Agreement Evidence Pack</w:t>
-            </w:r>
-          </w:p>
-        </w:tc>
-        <w:tc>
-          <w:tcPr>
-            <w:tcW w:w="1560" w:type="dxa"/>
-          </w:tcPr>
-          <w:p>
-            <w:pPr>
-              <w:spacing w:after="0"/>
-            </w:pPr>
-            <w:r>
-              <w:rPr>
-                <w:b/>
-              </w:rPr>
-              <w:t xml:space="preserve">No</w:t>
-            </w:r>
-          </w:p>
-        </w:tc>
-        <w:tc>
-          <w:tcPr>
-            <w:tcW w:w="1560" w:type="dxa"/>
-          </w:tcPr>
-          <w:p>
-            <w:pPr>
-              <w:spacing w:after="0"/>
-            </w:pPr>
-            <w:r>
-              <w:t xml:space="preserve">No</w:t>
-            </w:r>
-          </w:p>
-        </w:tc>
-        <w:tc>
-          <w:tcPr>
-            <w:tcW w:w="1560" w:type="dxa"/>
-          </w:tcPr>
-          <w:p>
-            <w:pPr>
-              <w:spacing w:after="0"/>
-            </w:pPr>
-            <w:r>
-              <w:t xml:space="preserve">No</w:t>
-            </w:r>
-          </w:p>
-        </w:tc>
-        <w:tc>
-          <w:tcPr>
-            <w:tcW w:w="1560" w:type="dxa"/>
-          </w:tcPr>
-          <w:p>
-            <w:pPr>
-              <w:spacing w:after="0"/>
-            </w:pPr>
-            <w:r>
-              <w:t xml:space="preserve">$0</w:t>
-            </w:r>
-          </w:p>
-        </w:tc>
-      </w:tr>
-      <w:tr>
-        <w:tc>
-          <w:tcPr>
-            <w:tcW w:w="1560" w:type="dxa"/>
-          </w:tcPr>
-          <w:p>
-            <w:pPr>
-              <w:spacing w:after="0"/>
-            </w:pPr>
-            <w:r>
-              <w:t xml:space="preserve">3</w:t>
-            </w:r>
-          </w:p>
-        </w:tc>
-        <w:tc>
-          <w:tcPr>
-            <w:tcW w:w="1560" w:type="dxa"/>
-          </w:tcPr>
-          <w:p>
-            <w:pPr>
-              <w:spacing w:after="0"/>
-            </w:pPr>
-            <w:r>
-              <w:t xml:space="preserve">Benchmark Access and Calibration</w:t>
-            </w:r>
-          </w:p>
-        </w:tc>
-        <w:tc>
-          <w:tcPr>
-            <w:tcW w:w="1560" w:type="dxa"/>
-          </w:tcPr>
-          <w:p>
-            <w:pPr>
-              <w:spacing w:after="0"/>
-            </w:pPr>
-            <w:r>
-              <w:rPr>
-                <w:b/>
-              </w:rPr>
-              <w:t xml:space="preserve">No</w:t>
-            </w:r>
-          </w:p>
-        </w:tc>
-        <w:tc>
-          <w:tcPr>
-            <w:tcW w:w="1560" w:type="dxa"/>
-          </w:tcPr>
-          <w:p>
-            <w:pPr>
-              <w:spacing w:after="0"/>
-            </w:pPr>
-            <w:r>
-              <w:t xml:space="preserve">No</w:t>
-            </w:r>
-          </w:p>
-        </w:tc>
-        <w:tc>
-          <w:tcPr>
-            <w:tcW w:w="1560" w:type="dxa"/>
-          </w:tcPr>
-          <w:p>
-            <w:pPr>
-              <w:spacing w:after="0"/>
-            </w:pPr>
-            <w:r>
-              <w:t xml:space="preserve">No</w:t>
-            </w:r>
-          </w:p>
-        </w:tc>
-        <w:tc>
-          <w:tcPr>
-            <w:tcW w:w="1560" w:type="dxa"/>
-          </w:tcPr>
-          <w:p>
-            <w:pPr>
-              <w:spacing w:after="0"/>
-            </w:pPr>
-            <w:r>
-              <w:t xml:space="preserve">$0</w:t>
-            </w:r>
-          </w:p>
-        </w:tc>
-      </w:tr>
     </w:tbl>
     <w:p>
       <w:pPr/>
@@ -723,10 +750,62 @@
         <w:rPr>
           <w:b/>
         </w:rPr>
-        <w:t xml:space="preserve">Nothing has been built yet. This tracker starts at zero on purpose</w:t>
-      </w:r>
-      <w:r>
-        <w:t xml:space="preserve">, so the first entry that changes is a real change and not a restatement.</w:t>
+        <w:t xml:space="preserve">LIVE means the offer page, price and buy path are on the site and reachable.</w:t>
+      </w:r>
+      <w:r>
+        <w:t xml:space="preserve"> It does not mean anyone has bought one. </w:t>
+      </w:r>
+      <w:r>
+        <w:rPr>
+          <w:b/>
+        </w:rPr>
+        <w:t xml:space="preserve">Revenue is $0 and no offer has been shown to a named buyer.</w:t>
+      </w:r>
+    </w:p>
+    <w:p>
+      <w:pPr>
+        <w:spacing w:after="140"/>
+      </w:pPr>
+      <w:r>
+        <w:rPr>
+          <w:b/>
+        </w:rPr>
+        <w:t xml:space="preserve">One thing stands between LIVE and sellable: the three checkout URLs.</w:t>
+      </w:r>
+      <w:r>
+        <w:t xml:space="preserve"> </w:t>
+      </w:r>
+      <w:r>
+        <w:rPr>
+          <w:rFonts w:ascii="Consolas" w:hAnsi="Consolas"/>
+        </w:rPr>
+        <w:t xml:space="preserve">api/_offer-config.js</w:t>
+      </w:r>
+      <w:r>
+        <w:t xml:space="preserve"> holds an empty </w:t>
+      </w:r>
+      <w:r>
+        <w:rPr>
+          <w:rFonts w:ascii="Consolas" w:hAnsi="Consolas"/>
+        </w:rPr>
+        <w:t xml:space="preserve">checkout_url</w:t>
+      </w:r>
+      <w:r>
+        <w:t xml:space="preserve"> per offer. Paste the real payment links and deploy; nothing else changes.</w:t>
+      </w:r>
+    </w:p>
+    <w:p>
+      <w:pPr>
+        <w:spacing w:after="140"/>
+      </w:pPr>
+      <w:r>
+        <w:rPr>
+          <w:b/>
+        </w:rPr>
+        <w:t xml:space="preserve">Built and live as of 2026-08-13.</w:t>
+      </w:r>
+      <w:r>
+        <w:t xml:space="preserve"> The tracker started at zero deliberately; this is the first entry that moved, and it moved because code was written and deployed, not because intent changed.</w:t>
       </w:r>
     </w:p>
     <w:p>
@@ -3251,6 +3330,505 @@
         <w:spacing w:after="140"/>
       </w:pPr>
       <w:r>
+        <w:t xml:space="preserve">3e. PAYMENT PATH (rev 4)</w:t>
+      </w:r>
+    </w:p>
+    <w:tbl>
+      <w:tblPr>
+        <w:tblStyle w:val="TableGrid"/>
+        <w:tblW w:w="9360" w:type="dxa"/>
+        <w:tblBorders>
+          <w:top w:val="single" w:sz="4" w:space="0" w:color="999999"/>
+          <w:left w:val="single" w:sz="4" w:space="0" w:color="999999"/>
+          <w:bottom w:val="single" w:sz="4" w:space="0" w:color="999999"/>
+          <w:right w:val="single" w:sz="4" w:space="0" w:color="999999"/>
+          <w:insideH w:val="single" w:sz="4" w:space="0" w:color="999999"/>
+          <w:insideV w:val="single" w:sz="4" w:space="0" w:color="999999"/>
+        </w:tblBorders>
+      </w:tblPr>
+      <w:tblGrid>
+        <w:gridCol w:w="4680"/>
+        <w:gridCol w:w="4680"/>
+      </w:tblGrid>
+      <w:tr>
+        <w:tc>
+          <w:tcPr>
+            <w:tcW w:w="4680" w:type="dxa"/>
+          </w:tcPr>
+          <w:p>
+            <w:pPr>
+              <w:spacing w:after="0"/>
+            </w:pPr>
+            <w:r>
+              <w:rPr>
+                <w:b/>
+              </w:rPr>
+              <w:t xml:space="preserve">Prices</w:t>
+            </w:r>
+          </w:p>
+        </w:tc>
+        <w:tc>
+          <w:tcPr>
+            <w:tcW w:w="4680" w:type="dxa"/>
+          </w:tcPr>
+          <w:p>
+            <w:pPr>
+              <w:spacing w:after="0"/>
+            </w:pPr>
+            <w:r>
+              <w:t xml:space="preserve">$250 / $500 / $750, declared once in </w:t>
+            </w:r>
+            <w:r>
+              <w:rPr>
+                <w:rFonts w:ascii="Consolas" w:hAnsi="Consolas"/>
+              </w:rPr>
+              <w:t xml:space="preserve">api/_offer-config.js</w:t>
+            </w:r>
+          </w:p>
+        </w:tc>
+      </w:tr>
+      <w:tr>
+        <w:tc>
+          <w:tcPr>
+            <w:tcW w:w="4680" w:type="dxa"/>
+          </w:tcPr>
+          <w:p>
+            <w:pPr>
+              <w:spacing w:after="0"/>
+            </w:pPr>
+            <w:r>
+              <w:rPr>
+                <w:b/>
+              </w:rPr>
+              <w:t xml:space="preserve">Buy path</w:t>
+            </w:r>
+          </w:p>
+        </w:tc>
+        <w:tc>
+          <w:tcPr>
+            <w:tcW w:w="4680" w:type="dxa"/>
+          </w:tcPr>
+          <w:p>
+            <w:pPr>
+              <w:spacing w:after="0"/>
+            </w:pPr>
+            <w:r>
+              <w:rPr>
+                <w:rFonts w:ascii="Consolas" w:hAnsi="Consolas"/>
+              </w:rPr>
+              <w:t xml:space="preserve">/api/checkout?o=&lt;offer&gt;</w:t>
+            </w:r>
+            <w:r>
+              <w:t xml:space="preserve"> from each intake page</w:t>
+            </w:r>
+          </w:p>
+        </w:tc>
+      </w:tr>
+      <w:tr>
+        <w:tc>
+          <w:tcPr>
+            <w:tcW w:w="4680" w:type="dxa"/>
+          </w:tcPr>
+          <w:p>
+            <w:pPr>
+              <w:spacing w:after="0"/>
+            </w:pPr>
+            <w:r>
+              <w:rPr>
+                <w:b/>
+              </w:rPr>
+              <w:t xml:space="preserve">Checkout URLs</w:t>
+            </w:r>
+          </w:p>
+        </w:tc>
+        <w:tc>
+          <w:tcPr>
+            <w:tcW w:w="4680" w:type="dxa"/>
+          </w:tcPr>
+          <w:p>
+            <w:pPr>
+              <w:spacing w:after="0"/>
+            </w:pPr>
+            <w:r>
+              <w:rPr>
+                <w:b/>
+              </w:rPr>
+              <w:t xml:space="preserve">`[REQUIRES USER INPUT]`. Empty on purpose</w:t>
+            </w:r>
+          </w:p>
+        </w:tc>
+      </w:tr>
+      <w:tr>
+        <w:tc>
+          <w:tcPr>
+            <w:tcW w:w="4680" w:type="dxa"/>
+          </w:tcPr>
+          <w:p>
+            <w:pPr>
+              <w:spacing w:after="0"/>
+            </w:pPr>
+            <w:r>
+              <w:rPr>
+                <w:b/>
+              </w:rPr>
+              <w:t xml:space="preserve">Behaviour today</w:t>
+            </w:r>
+          </w:p>
+        </w:tc>
+        <w:tc>
+          <w:tcPr>
+            <w:tcW w:w="4680" w:type="dxa"/>
+          </w:tcPr>
+          <w:p>
+            <w:pPr>
+              <w:spacing w:after="0"/>
+            </w:pPr>
+            <w:r>
+              <w:t xml:space="preserve">503 with the price and an invoice-by-email path. </w:t>
+            </w:r>
+            <w:r>
+              <w:rPr>
+                <w:b/>
+              </w:rPr>
+              <w:t xml:space="preserve">No Location header, no guessed destination</w:t>
+            </w:r>
+          </w:p>
+        </w:tc>
+      </w:tr>
+      <w:tr>
+        <w:tc>
+          <w:tcPr>
+            <w:tcW w:w="4680" w:type="dxa"/>
+          </w:tcPr>
+          <w:p>
+            <w:pPr>
+              <w:spacing w:after="0"/>
+            </w:pPr>
+            <w:r>
+              <w:rPr>
+                <w:b/>
+              </w:rPr>
+              <w:t xml:space="preserve">Telemetry</w:t>
+            </w:r>
+          </w:p>
+        </w:tc>
+        <w:tc>
+          <w:tcPr>
+            <w:tcW w:w="4680" w:type="dxa"/>
+          </w:tcPr>
+          <w:p>
+            <w:pPr>
+              <w:spacing w:after="0"/>
+            </w:pPr>
+            <w:r>
+              <w:rPr>
+                <w:rFonts w:ascii="Consolas" w:hAnsi="Consolas"/>
+              </w:rPr>
+              <w:t xml:space="preserve">checkout-click</w:t>
+            </w:r>
+            <w:r>
+              <w:t xml:space="preserve">, state </w:t>
+            </w:r>
+            <w:r>
+              <w:rPr>
+                <w:rFonts w:ascii="Consolas" w:hAnsi="Consolas"/>
+              </w:rPr>
+              <w:t xml:space="preserve">redirected</w:t>
+            </w:r>
+            <w:r>
+              <w:t xml:space="preserve"> or </w:t>
+            </w:r>
+            <w:r>
+              <w:rPr>
+                <w:rFonts w:ascii="Consolas" w:hAnsi="Consolas"/>
+              </w:rPr>
+              <w:t xml:space="preserve">unconfigured</w:t>
+            </w:r>
+            <w:r>
+              <w:t xml:space="preserve">, read by </w:t>
+            </w:r>
+            <w:r>
+              <w:rPr>
+                <w:rFonts w:ascii="Consolas" w:hAnsi="Consolas"/>
+              </w:rPr>
+              <w:t xml:space="preserve">/api/asset-stats</w:t>
+            </w:r>
+            <w:r>
+              <w:t xml:space="preserve">, shown on the dashboard</w:t>
+            </w:r>
+          </w:p>
+        </w:tc>
+      </w:tr>
+    </w:tbl>
+    <w:p>
+      <w:pPr/>
+      <w:r>
+        <w:t/>
+      </w:r>
+    </w:p>
+    <w:p>
+      <w:pPr>
+        <w:spacing w:after="140"/>
+      </w:pPr>
+      <w:r>
+        <w:rPr>
+          <w:b/>
+        </w:rPr>
+        <w:t xml:space="preserve">Why the URLs are empty rather than filled with something plausible.</w:t>
+      </w:r>
+      <w:r>
+        <w:t xml:space="preserve"> A Stripe Payment Link or Lemon Squeezy checkout can only be created inside the owner's own payment account. Nothing in this repository can mint one. </w:t>
+      </w:r>
+      <w:r>
+        <w:rPr>
+          <w:b/>
+        </w:rPr>
+        <w:t xml:space="preserve">A realistic-looking URL written here would be a fabricated payment destination</w:t>
+      </w:r>
+      <w:r>
+        <w:t xml:space="preserve">: a dead link shown to a paying customer at best, money sent somewhere unintended at worst.</w:t>
+      </w:r>
+    </w:p>
+    <w:p>
+      <w:pPr>
+        <w:spacing w:after="140"/>
+      </w:pPr>
+      <w:r>
+        <w:rPr>
+          <w:b/>
+        </w:rPr>
+        <w:t xml:space="preserve">The `unconfigured` counter is the number to watch.</w:t>
+      </w:r>
+      <w:r>
+        <w:t xml:space="preserve"> A non-zero value means somebody tried to pay and could not.</w:t>
+      </w:r>
+    </w:p>
+    <w:p>
+      <w:pPr>
+        <w:pStyle w:val="Heading3"/>
+        <w:spacing w:after="140"/>
+      </w:pPr>
+      <w:r>
+        <w:t xml:space="preserve">Going live</w:t>
+      </w:r>
+    </w:p>
+    <w:p>
+      <w:pPr>
+        <w:numPr>
+          <w:ilvl w:val="0"/>
+          <w:numId w:val="2"/>
+        </w:numPr>
+        <w:spacing w:after="60"/>
+      </w:pPr>
+      <w:r>
+        <w:t xml:space="preserve">Create one payment link per offer in the provider dashboard: $250, $500, $750.</w:t>
+      </w:r>
+    </w:p>
+    <w:p>
+      <w:pPr>
+        <w:numPr>
+          <w:ilvl w:val="0"/>
+          <w:numId w:val="2"/>
+        </w:numPr>
+        <w:spacing w:after="60"/>
+      </w:pPr>
+      <w:r>
+        <w:t xml:space="preserve">Paste each into </w:t>
+      </w:r>
+      <w:r>
+        <w:rPr>
+          <w:rFonts w:ascii="Consolas" w:hAnsi="Consolas"/>
+        </w:rPr>
+        <w:t xml:space="preserve">checkout_url</w:t>
+      </w:r>
+      <w:r>
+        <w:t xml:space="preserve"> in </w:t>
+      </w:r>
+      <w:r>
+        <w:rPr>
+          <w:rFonts w:ascii="Consolas" w:hAnsi="Consolas"/>
+        </w:rPr>
+        <w:t xml:space="preserve">api/_offer-config.js</w:t>
+      </w:r>
+      <w:r>
+        <w:t xml:space="preserve">.</w:t>
+      </w:r>
+    </w:p>
+    <w:p>
+      <w:pPr>
+        <w:numPr>
+          <w:ilvl w:val="0"/>
+          <w:numId w:val="2"/>
+        </w:numPr>
+        <w:spacing w:after="60"/>
+      </w:pPr>
+      <w:r>
+        <w:t xml:space="preserve">Deploy. </w:t>
+      </w:r>
+      <w:r>
+        <w:rPr>
+          <w:rFonts w:ascii="Consolas" w:hAnsi="Consolas"/>
+        </w:rPr>
+        <w:t xml:space="preserve">/api/checkout</w:t>
+      </w:r>
+      <w:r>
+        <w:t xml:space="preserve"> starts redirecting the moment a valid https URL is present.</w:t>
+      </w:r>
+    </w:p>
+    <w:p>
+      <w:pPr>
+        <w:pBdr>
+          <w:bottom w:val="single" w:sz="6" w:space="1" w:color="AAAAAA"/>
+        </w:pBdr>
+      </w:pPr>
+    </w:p>
+    <w:p>
+      <w:pPr>
+        <w:pStyle w:val="Heading2"/>
+        <w:spacing w:after="140"/>
+      </w:pPr>
+      <w:r>
+        <w:t xml:space="preserve">3f. BENCHMARK SCORING (rev 4)</w:t>
+      </w:r>
+    </w:p>
+    <w:p>
+      <w:pPr>
+        <w:spacing w:after="140"/>
+      </w:pPr>
+      <w:r>
+        <w:rPr>
+          <w:rFonts w:ascii="Consolas" w:hAnsi="Consolas"/>
+        </w:rPr>
+        <w:t xml:space="preserve">api/bench-score.js</w:t>
+      </w:r>
+      <w:r>
+        <w:t xml:space="preserve">. A licensee POSTs determinations and receives </w:t>
+      </w:r>
+      <w:r>
+        <w:rPr>
+          <w:b/>
+        </w:rPr>
+        <w:t xml:space="preserve">aggregate calibration only</w:t>
+      </w:r>
+      <w:r>
+        <w:t xml:space="preserve">: agreement with the key, chance-corrected AC1, their own distribution, and the detection-panel figures read live.</w:t>
+      </w:r>
+    </w:p>
+    <w:p>
+      <w:pPr>
+        <w:spacing w:after="140"/>
+      </w:pPr>
+      <w:r>
+        <w:rPr>
+          <w:b/>
+        </w:rPr>
+        <w:t xml:space="preserve">It never returns the key, per-record results, or the condition logic</w:t>
+      </w:r>
+      <w:r>
+        <w:t xml:space="preserve">, by construction rather than by filtering the response at the end. Per-record feedback across a few runs is exactly how a licensee would reconstruct the key.</w:t>
+      </w:r>
+    </w:p>
+    <w:p>
+      <w:pPr>
+        <w:spacing w:after="140"/>
+      </w:pPr>
+      <w:r>
+        <w:rPr>
+          <w:b/>
+        </w:rPr>
+        <w:t xml:space="preserve">It returns 503 `key_not_provisioned` today, and that is correct.</w:t>
+      </w:r>
+      <w:r>
+        <w:t xml:space="preserve"> The detection key is in </w:t>
+      </w:r>
+      <w:r>
+        <w:rPr>
+          <w:rFonts w:ascii="Consolas" w:hAnsi="Consolas"/>
+        </w:rPr>
+        <w:t xml:space="preserve">research/</w:t>
+      </w:r>
+      <w:r>
+        <w:t xml:space="preserve">, which is deliberately not deployed. The endpoint </w:t>
+      </w:r>
+      <w:r>
+        <w:rPr>
+          <w:b/>
+        </w:rPr>
+        <w:t xml:space="preserve">refuses to fall back</w:t>
+      </w:r>
+      <w:r>
+        <w:t xml:space="preserve"> to </w:t>
+      </w:r>
+      <w:r>
+        <w:rPr>
+          <w:rFonts w:ascii="Consolas" w:hAnsi="Consolas"/>
+        </w:rPr>
+        <w:t xml:space="preserve">bench_gold</w:t>
+      </w:r>
+      <w:r>
+        <w:t xml:space="preserve"> (three synthetic placeholder rows, anon-readable) or </w:t>
+      </w:r>
+      <w:r>
+        <w:rPr>
+          <w:rFonts w:ascii="Consolas" w:hAnsi="Consolas"/>
+        </w:rPr>
+        <w:t xml:space="preserve">bench_outcomes</w:t>
+      </w:r>
+      <w:r>
+        <w:t xml:space="preserve"> (the Rung 3 real-case outcome table). Either would produce a confident, meaningless number.</w:t>
+      </w:r>
+    </w:p>
+    <w:p>
+      <w:pPr>
+        <w:spacing w:after="140"/>
+      </w:pPr>
+      <w:r>
+        <w:rPr>
+          <w:b/>
+        </w:rPr>
+        <w:t xml:space="preserve">To provision:</w:t>
+      </w:r>
+      <w:r>
+        <w:t xml:space="preserve"> set </w:t>
+      </w:r>
+      <w:r>
+        <w:rPr>
+          <w:rFonts w:ascii="Consolas" w:hAnsi="Consolas"/>
+        </w:rPr>
+        <w:t xml:space="preserve">BENCH_KEY_JSON</w:t>
+      </w:r>
+      <w:r>
+        <w:t xml:space="preserve"> and </w:t>
+      </w:r>
+      <w:r>
+        <w:rPr>
+          <w:rFonts w:ascii="Consolas" w:hAnsi="Consolas"/>
+        </w:rPr>
+        <w:t xml:space="preserve">BENCH_SCORE_TOKENS</w:t>
+      </w:r>
+      <w:r>
+        <w:t xml:space="preserve"> in the server environment. </w:t>
+      </w:r>
+      <w:r>
+        <w:rPr>
+          <w:rFonts w:ascii="Consolas" w:hAnsi="Consolas"/>
+        </w:rPr>
+        <w:t xml:space="preserve">[REQUIRES USER INPUT]</w:t>
+      </w:r>
+    </w:p>
+    <w:p>
+      <w:pPr>
+        <w:pBdr>
+          <w:bottom w:val="single" w:sz="6" w:space="1" w:color="AAAAAA"/>
+        </w:pBdr>
+      </w:pPr>
+    </w:p>
+    <w:p>
+      <w:pPr>
+        <w:pStyle w:val="Heading2"/>
+        <w:spacing w:after="140"/>
+      </w:pPr>
+      <w:r>
         <w:t xml:space="preserve">4. LIVE BASELINE, THE NUMBERS EVERY PACKAGE INHERITS</w:t>
       </w:r>
     </w:p>
@@ -4549,6 +5127,86 @@
             </w:pPr>
             <w:r>
               <w:t xml:space="preserve">Change</w:t>
+            </w:r>
+          </w:p>
+        </w:tc>
+      </w:tr>
+      <w:tr>
+        <w:tc>
+          <w:tcPr>
+            <w:tcW w:w="3120" w:type="dxa"/>
+          </w:tcPr>
+          <w:p>
+            <w:pPr>
+              <w:spacing w:after="0"/>
+            </w:pPr>
+            <w:r>
+              <w:t xml:space="preserve">4</w:t>
+            </w:r>
+          </w:p>
+        </w:tc>
+        <w:tc>
+          <w:tcPr>
+            <w:tcW w:w="3120" w:type="dxa"/>
+          </w:tcPr>
+          <w:p>
+            <w:pPr>
+              <w:spacing w:after="0"/>
+            </w:pPr>
+            <w:r>
+              <w:t xml:space="preserve">2026-08-13</w:t>
+            </w:r>
+          </w:p>
+        </w:tc>
+        <w:tc>
+          <w:tcPr>
+            <w:tcW w:w="3120" w:type="dxa"/>
+          </w:tcPr>
+          <w:p>
+            <w:pPr>
+              <w:spacing w:after="0"/>
+            </w:pPr>
+            <w:r>
+              <w:rPr>
+                <w:b/>
+              </w:rPr>
+              <w:t xml:space="preserve">Packages moved to LIVE.</w:t>
+            </w:r>
+            <w:r>
+              <w:t xml:space="preserve"> Prices fixed at $250 / $500 / $750 from one config; buy path, checkout telemetry and benchmark scoring endpoint written and deployed. New sections 3e and 3f. </w:t>
+            </w:r>
+            <w:r>
+              <w:rPr>
+                <w:b/>
+              </w:rPr>
+              <w:t xml:space="preserve">Checkout URLs deliberately left empty</w:t>
+            </w:r>
+            <w:r>
+              <w:t xml:space="preserve">: they can only be minted in the owner's payment account, and a plausible-looking one would be a fabricated payment destination, so </w:t>
+            </w:r>
+            <w:r>
+              <w:rPr>
+                <w:rFonts w:ascii="Consolas" w:hAnsi="Consolas"/>
+              </w:rPr>
+              <w:t xml:space="preserve">/api/checkout</w:t>
+            </w:r>
+            <w:r>
+              <w:t xml:space="preserve"> fails safe to an invoice path instead of guessing. </w:t>
+            </w:r>
+            <w:r>
+              <w:rPr>
+                <w:rFonts w:ascii="Consolas" w:hAnsi="Consolas"/>
+              </w:rPr>
+              <w:t xml:space="preserve">bench-score</w:t>
+            </w:r>
+            <w:r>
+              <w:t xml:space="preserve"> refuses to score without the real key rather than falling back to synthetic or unrelated tables. </w:t>
+            </w:r>
+            <w:r>
+              <w:rPr>
+                <w:b/>
+              </w:rPr>
+              <w:t xml:space="preserve">Revenue still $0 and no offer shown to a named buyer.</w:t>
             </w:r>
           </w:p>
         </w:tc>

</xml_diff>

<commit_message>
Record the incentive pivot and completed honors
Co-Authored-By: Claude Opus 5 <noreply@anthropic.com>
Claude-Session: https://claude.ai/code/session_01W9UtE7X76spacWeSvBH7tv
</commit_message>
<xml_diff>
--- a/IP_COMMERCIALIZATION_TRACKER.docx
+++ b/IP_COMMERCIALIZATION_TRACKER.docx
@@ -122,7 +122,7 @@
               <w:spacing w:after="0"/>
             </w:pPr>
             <w:r>
-              <w:t xml:space="preserve">2026-08-13 (rev 4)</w:t>
+              <w:t xml:space="preserve">2026-08-14 (rev 5)</w:t>
             </w:r>
           </w:p>
         </w:tc>
@@ -153,7 +153,7 @@
               <w:spacing w:after="0"/>
             </w:pPr>
             <w:r>
-              <w:t xml:space="preserve">4</w:t>
+              <w:t xml:space="preserve">5</w:t>
             </w:r>
           </w:p>
         </w:tc>
@@ -3829,6 +3829,450 @@
         <w:spacing w:after="140"/>
       </w:pPr>
       <w:r>
+        <w:t xml:space="preserve">3g. COMPLETER INCENTIVE: FROM FREE GRANT TO AWARD PLUS PAID CONVERSION (rev 5)</w:t>
+      </w:r>
+    </w:p>
+    <w:p>
+      <w:pPr>
+        <w:spacing w:after="140"/>
+      </w:pPr>
+      <w:r>
+        <w:rPr>
+          <w:b/>
+        </w:rPr>
+        <w:t xml:space="preserve">The outreach was giving the product away to the people most likely to buy it.</w:t>
+      </w:r>
+    </w:p>
+    <w:p>
+      <w:pPr>
+        <w:spacing w:after="140"/>
+      </w:pPr>
+      <w:r>
+        <w:t xml:space="preserve">Every one of the 36 completers was offered, on confirmation and at no charge:</w:t>
+      </w:r>
+    </w:p>
+    <w:p>
+      <w:pPr>
+        <w:numPr>
+          <w:ilvl w:val="0"/>
+          <w:numId w:val="1"/>
+        </w:numPr>
+        <w:spacing w:after="60"/>
+      </w:pPr>
+      <w:r>
+        <w:t xml:space="preserve">a Founding Auditor and Commercial Practice License</w:t>
+      </w:r>
+    </w:p>
+    <w:p>
+      <w:pPr>
+        <w:numPr>
+          <w:ilvl w:val="0"/>
+          <w:numId w:val="1"/>
+        </w:numPr>
+        <w:spacing w:after="60"/>
+      </w:pPr>
+      <w:r>
+        <w:t xml:space="preserve">Commercial Practice Rights, to use the rubrics and field guides in their own client work</w:t>
+      </w:r>
+    </w:p>
+    <w:p>
+      <w:pPr>
+        <w:numPr>
+          <w:ilvl w:val="0"/>
+          <w:numId w:val="1"/>
+        </w:numPr>
+        <w:spacing w:after="60"/>
+      </w:pPr>
+      <w:r>
+        <w:t xml:space="preserve">an Institutional Enterprise Grant, a 12-month organizational deployment licence</w:t>
+      </w:r>
+    </w:p>
+    <w:p>
+      <w:pPr>
+        <w:spacing w:after="140"/>
+      </w:pPr>
+      <w:r>
+        <w:rPr>
+          <w:b/>
+        </w:rPr>
+        <w:t xml:space="preserve">That is a blanket giveaway of the only thing being sold, to the largest single group of qualified buyers this programme has.</w:t>
+      </w:r>
+      <w:r>
+        <w:t xml:space="preserve"> Thirty-six governance and compliance professionals in 16 countries is precisely the customer list.</w:t>
+      </w:r>
+    </w:p>
+    <w:p>
+      <w:pPr>
+        <w:pStyle w:val="Heading3"/>
+        <w:spacing w:after="140"/>
+      </w:pPr>
+      <w:r>
+        <w:t xml:space="preserve">What confirming unlocks now</w:t>
+      </w:r>
+    </w:p>
+    <w:tbl>
+      <w:tblPr>
+        <w:tblStyle w:val="TableGrid"/>
+        <w:tblW w:w="9360" w:type="dxa"/>
+        <w:tblBorders>
+          <w:top w:val="single" w:sz="4" w:space="0" w:color="999999"/>
+          <w:left w:val="single" w:sz="4" w:space="0" w:color="999999"/>
+          <w:bottom w:val="single" w:sz="4" w:space="0" w:color="999999"/>
+          <w:right w:val="single" w:sz="4" w:space="0" w:color="999999"/>
+          <w:insideH w:val="single" w:sz="4" w:space="0" w:color="999999"/>
+          <w:insideV w:val="single" w:sz="4" w:space="0" w:color="999999"/>
+        </w:tblBorders>
+      </w:tblPr>
+      <w:tblGrid>
+        <w:gridCol w:w="4680"/>
+        <w:gridCol w:w="4680"/>
+      </w:tblGrid>
+      <w:tr>
+        <w:tc>
+          <w:tcPr>
+            <w:tcW w:w="4680" w:type="dxa"/>
+          </w:tcPr>
+          <w:p>
+            <w:pPr>
+              <w:spacing w:after="0"/>
+            </w:pPr>
+            <w:r>
+              <w:rPr>
+                <w:b/>
+              </w:rPr>
+              <w:t xml:space="preserve">Appointed Expert Award Citation</w:t>
+            </w:r>
+          </w:p>
+        </w:tc>
+        <w:tc>
+          <w:tcPr>
+            <w:tcW w:w="4680" w:type="dxa"/>
+          </w:tcPr>
+          <w:p>
+            <w:pPr>
+              <w:spacing w:after="0"/>
+            </w:pPr>
+            <w:r>
+              <w:t xml:space="preserve">Issued in their name</w:t>
+            </w:r>
+          </w:p>
+        </w:tc>
+      </w:tr>
+      <w:tr>
+        <w:tc>
+          <w:tcPr>
+            <w:tcW w:w="4680" w:type="dxa"/>
+          </w:tcPr>
+          <w:p>
+            <w:pPr>
+              <w:spacing w:after="0"/>
+            </w:pPr>
+            <w:r>
+              <w:rPr>
+                <w:b/>
+              </w:rPr>
+              <w:t xml:space="preserve">Official Panelist Registry ID</w:t>
+            </w:r>
+          </w:p>
+        </w:tc>
+        <w:tc>
+          <w:tcPr>
+            <w:tcW w:w="4680" w:type="dxa"/>
+          </w:tcPr>
+          <w:p>
+            <w:pPr>
+              <w:spacing w:after="0"/>
+            </w:pPr>
+            <w:r>
+              <w:t xml:space="preserve">A verifiable reference</w:t>
+            </w:r>
+          </w:p>
+        </w:tc>
+      </w:tr>
+      <w:tr>
+        <w:tc>
+          <w:tcPr>
+            <w:tcW w:w="4680" w:type="dxa"/>
+          </w:tcPr>
+          <w:p>
+            <w:pPr>
+              <w:spacing w:after="0"/>
+            </w:pPr>
+            <w:r>
+              <w:rPr>
+                <w:b/>
+              </w:rPr>
+              <w:t xml:space="preserve">Anything else</w:t>
+            </w:r>
+          </w:p>
+        </w:tc>
+        <w:tc>
+          <w:tcPr>
+            <w:tcW w:w="4680" w:type="dxa"/>
+          </w:tcPr>
+          <w:p>
+            <w:pPr>
+              <w:spacing w:after="0"/>
+            </w:pPr>
+            <w:r>
+              <w:rPr>
+                <w:b/>
+              </w:rPr>
+              <w:t xml:space="preserve">Nothing.</w:t>
+            </w:r>
+            <w:r>
+              <w:t xml:space="preserve"> No licence, and the message says so plainly</w:t>
+            </w:r>
+          </w:p>
+        </w:tc>
+      </w:tr>
+    </w:tbl>
+    <w:p>
+      <w:pPr/>
+      <w:r>
+        <w:t/>
+      </w:r>
+    </w:p>
+    <w:p>
+      <w:pPr>
+        <w:spacing w:after="140"/>
+      </w:pPr>
+      <w:r>
+        <w:rPr>
+          <w:b/>
+        </w:rPr>
+        <w:t xml:space="preserve">The message states the boundary rather than leaving it to be discovered</w:t>
+      </w:r>
+      <w:r>
+        <w:t xml:space="preserve">, then routes anyone who wants to use JRS in practice to the three paid tiers, with the free seven-point check named as the way to evaluate the method first.</w:t>
+      </w:r>
+    </w:p>
+    <w:p>
+      <w:pPr>
+        <w:pStyle w:val="Heading3"/>
+        <w:spacing w:after="140"/>
+      </w:pPr>
+      <w:r>
+        <w:t xml:space="preserve">Prices are read, never restated</w:t>
+      </w:r>
+    </w:p>
+    <w:p>
+      <w:pPr>
+        <w:spacing w:after="140"/>
+      </w:pPr>
+      <w:r>
+        <w:t xml:space="preserve">The three tiers now appear in 36 messages. </w:t>
+      </w:r>
+      <w:r>
+        <w:rPr>
+          <w:b/>
+        </w:rPr>
+        <w:t xml:space="preserve">They are parsed from `api/_offer-config.js` at generation time.</w:t>
+      </w:r>
+      <w:r>
+        <w:t xml:space="preserve"> Three prices copied into 36 files is the worst possible place for a second copy of a fact.</w:t>
+      </w:r>
+    </w:p>
+    <w:p>
+      <w:pPr>
+        <w:pStyle w:val="Heading3"/>
+        <w:spacing w:after="140"/>
+      </w:pPr>
+      <w:r>
+        <w:t xml:space="preserve">Honors completed</w:t>
+      </w:r>
+    </w:p>
+    <w:p>
+      <w:pPr>
+        <w:spacing w:after="140"/>
+      </w:pPr>
+      <w:r>
+        <w:rPr>
+          <w:rFonts w:ascii="Consolas" w:hAnsi="Consolas"/>
+        </w:rPr>
+        <w:t xml:space="preserve">RR-113</w:t>
+      </w:r>
+      <w:r>
+        <w:t xml:space="preserve">, </w:t>
+      </w:r>
+      <w:r>
+        <w:rPr>
+          <w:rFonts w:ascii="Consolas" w:hAnsi="Consolas"/>
+        </w:rPr>
+        <w:t xml:space="preserve">RR-117</w:t>
+      </w:r>
+      <w:r>
+        <w:t xml:space="preserve"> and </w:t>
+      </w:r>
+      <w:r>
+        <w:rPr>
+          <w:rFonts w:ascii="Consolas" w:hAnsi="Consolas"/>
+        </w:rPr>
+        <w:t xml:space="preserve">RR-127</w:t>
+      </w:r>
+      <w:r>
+        <w:t xml:space="preserve"> finished after the honor roster was built on 2026-08-09 and were the only completers without one. Added as </w:t>
+      </w:r>
+      <w:r>
+        <w:rPr>
+          <w:b/>
+        </w:rPr>
+        <w:t xml:space="preserve">H-2026-35 to 37</w:t>
+      </w:r>
+      <w:r>
+        <w:t xml:space="preserve">, verified live. </w:t>
+      </w:r>
+      <w:r>
+        <w:rPr>
+          <w:b/>
+        </w:rPr>
+        <w:t xml:space="preserve">All 36 completers now hold an Honor.</w:t>
+      </w:r>
+    </w:p>
+    <w:p>
+      <w:pPr>
+        <w:pStyle w:val="Heading3"/>
+        <w:spacing w:after="140"/>
+      </w:pPr>
+      <w:r>
+        <w:t xml:space="preserve">Guarding the pivot</w:t>
+      </w:r>
+    </w:p>
+    <w:p>
+      <w:pPr>
+        <w:spacing w:after="140"/>
+      </w:pPr>
+      <w:r>
+        <w:t xml:space="preserve">Two assertions were added so the grant language cannot creep back and a price cannot drift:</w:t>
+      </w:r>
+    </w:p>
+    <w:tbl>
+      <w:tblPr>
+        <w:tblStyle w:val="TableGrid"/>
+        <w:tblW w:w="9360" w:type="dxa"/>
+        <w:tblBorders>
+          <w:top w:val="single" w:sz="4" w:space="0" w:color="999999"/>
+          <w:left w:val="single" w:sz="4" w:space="0" w:color="999999"/>
+          <w:bottom w:val="single" w:sz="4" w:space="0" w:color="999999"/>
+          <w:right w:val="single" w:sz="4" w:space="0" w:color="999999"/>
+          <w:insideH w:val="single" w:sz="4" w:space="0" w:color="999999"/>
+          <w:insideV w:val="single" w:sz="4" w:space="0" w:color="999999"/>
+        </w:tblBorders>
+      </w:tblPr>
+      <w:tblGrid>
+        <w:gridCol w:w="4680"/>
+        <w:gridCol w:w="4680"/>
+      </w:tblGrid>
+      <w:tr>
+        <w:tc>
+          <w:tcPr>
+            <w:tcW w:w="4680" w:type="dxa"/>
+          </w:tcPr>
+          <w:p>
+            <w:pPr>
+              <w:spacing w:after="0"/>
+            </w:pPr>
+            <w:r>
+              <w:t xml:space="preserve">Injection</w:t>
+            </w:r>
+          </w:p>
+        </w:tc>
+        <w:tc>
+          <w:tcPr>
+            <w:tcW w:w="4680" w:type="dxa"/>
+          </w:tcPr>
+          <w:p>
+            <w:pPr>
+              <w:spacing w:after="0"/>
+            </w:pPr>
+            <w:r>
+              <w:t xml:space="preserve">Result</w:t>
+            </w:r>
+          </w:p>
+        </w:tc>
+      </w:tr>
+      <w:tr>
+        <w:tc>
+          <w:tcPr>
+            <w:tcW w:w="4680" w:type="dxa"/>
+          </w:tcPr>
+          <w:p>
+            <w:pPr>
+              <w:spacing w:after="0"/>
+            </w:pPr>
+            <w:r>
+              <w:t xml:space="preserve">Reintroduce an Institutional Enterprise Grant</w:t>
+            </w:r>
+          </w:p>
+        </w:tc>
+        <w:tc>
+          <w:tcPr>
+            <w:tcW w:w="4680" w:type="dxa"/>
+          </w:tcPr>
+          <w:p>
+            <w:pPr>
+              <w:spacing w:after="0"/>
+            </w:pPr>
+            <w:r>
+              <w:rPr>
+                <w:b/>
+              </w:rPr>
+              <w:t xml:space="preserve">caught in all 36 files</w:t>
+            </w:r>
+          </w:p>
+        </w:tc>
+      </w:tr>
+      <w:tr>
+        <w:tc>
+          <w:tcPr>
+            <w:tcW w:w="4680" w:type="dxa"/>
+          </w:tcPr>
+          <w:p>
+            <w:pPr>
+              <w:spacing w:after="0"/>
+            </w:pPr>
+            <w:r>
+              <w:t xml:space="preserve">Change a price in the config only</w:t>
+            </w:r>
+          </w:p>
+        </w:tc>
+        <w:tc>
+          <w:tcPr>
+            <w:tcW w:w="4680" w:type="dxa"/>
+          </w:tcPr>
+          <w:p>
+            <w:pPr>
+              <w:spacing w:after="0"/>
+            </w:pPr>
+            <w:r>
+              <w:rPr>
+                <w:b/>
+              </w:rPr>
+              <w:t xml:space="preserve">caught in all 36 files</w:t>
+            </w:r>
+          </w:p>
+        </w:tc>
+      </w:tr>
+    </w:tbl>
+    <w:p>
+      <w:pPr/>
+      <w:r>
+        <w:t/>
+      </w:r>
+    </w:p>
+    <w:p>
+      <w:pPr>
+        <w:pBdr>
+          <w:bottom w:val="single" w:sz="6" w:space="1" w:color="AAAAAA"/>
+        </w:pBdr>
+      </w:pPr>
+    </w:p>
+    <w:p>
+      <w:pPr>
+        <w:pStyle w:val="Heading2"/>
+        <w:spacing w:after="140"/>
+      </w:pPr>
+      <w:r>
         <w:t xml:space="preserve">4. LIVE BASELINE, THE NUMBERS EVERY PACKAGE INHERITS</w:t>
       </w:r>
     </w:p>
@@ -5127,6 +5571,62 @@
             </w:pPr>
             <w:r>
               <w:t xml:space="preserve">Change</w:t>
+            </w:r>
+          </w:p>
+        </w:tc>
+      </w:tr>
+      <w:tr>
+        <w:tc>
+          <w:tcPr>
+            <w:tcW w:w="3120" w:type="dxa"/>
+          </w:tcPr>
+          <w:p>
+            <w:pPr>
+              <w:spacing w:after="0"/>
+            </w:pPr>
+            <w:r>
+              <w:t xml:space="preserve">5</w:t>
+            </w:r>
+          </w:p>
+        </w:tc>
+        <w:tc>
+          <w:tcPr>
+            <w:tcW w:w="3120" w:type="dxa"/>
+          </w:tcPr>
+          <w:p>
+            <w:pPr>
+              <w:spacing w:after="0"/>
+            </w:pPr>
+            <w:r>
+              <w:t xml:space="preserve">2026-08-14</w:t>
+            </w:r>
+          </w:p>
+        </w:tc>
+        <w:tc>
+          <w:tcPr>
+            <w:tcW w:w="3120" w:type="dxa"/>
+          </w:tcPr>
+          <w:p>
+            <w:pPr>
+              <w:spacing w:after="0"/>
+            </w:pPr>
+            <w:r>
+              <w:rPr>
+                <w:b/>
+              </w:rPr>
+              <w:t xml:space="preserve">Free promotional grants eliminated.</w:t>
+            </w:r>
+            <w:r>
+              <w:t xml:space="preserve"> The outreach had offered all 36 completers a Founding Auditor and Commercial Practice License, Commercial Practice Rights and a 12-month Institutional Enterprise Grant at no charge, which gives the product away to the largest group of qualified buyers the programme has. Confirming now unlocks the Appointed Expert Award Citation and Official Panelist Registry ID only, the message states that boundary plainly, and anyone wanting practice use is routed to the $250 / $500 / $750 tiers. Prices parsed from </w:t>
+            </w:r>
+            <w:r>
+              <w:rPr>
+                <w:rFonts w:ascii="Consolas" w:hAnsi="Consolas"/>
+              </w:rPr>
+              <w:t xml:space="preserve">api/_offer-config.js</w:t>
+            </w:r>
+            <w:r>
+              <w:t xml:space="preserve">, never restated. Honors completed at H-2026-35 to 37 so all 36 completers hold one. New section 3g. Two regression assertions added and adversarially confirmed.</w:t>
             </w:r>
           </w:p>
         </w:tc>

</xml_diff>

<commit_message>
Verify the commercialization pivot across the codebase
All four directives checked against disk and production rather than
re-run. Nothing needed repair.

0 free-grant phrases in any sendable or live surface; 36 of 36 messages
carry the Award Citation and Registry ID; honors span H-2026-02 to
H-2026-37 with every completer covered; all three tiers route correctly
with a 503 fail-safe and no Location header; 69 assertions across 5
suites pass; 0 of 11 prohibited claims repo-wide.

Regenerating produced no diff, so the generator is deterministic from its
sources and rebuilding cannot quietly change what 36 people are sent.

IP_COMMERCIALIZATION_TRACKER to rev 6.

Co-Authored-By: Claude Opus 5 <noreply@anthropic.com>
Claude-Session: https://claude.ai/code/session_01W9UtE7X76spacWeSvBH7tv
</commit_message>
<xml_diff>
--- a/IP_COMMERCIALIZATION_TRACKER.docx
+++ b/IP_COMMERCIALIZATION_TRACKER.docx
@@ -122,7 +122,7 @@
               <w:spacing w:after="0"/>
             </w:pPr>
             <w:r>
-              <w:t xml:space="preserve">2026-08-14 (rev 5)</w:t>
+              <w:t xml:space="preserve">2026-08-14 (rev 6)</w:t>
             </w:r>
           </w:p>
         </w:tc>
@@ -153,7 +153,7 @@
               <w:spacing w:after="0"/>
             </w:pPr>
             <w:r>
-              <w:t xml:space="preserve">5</w:t>
+              <w:t xml:space="preserve">6</w:t>
             </w:r>
           </w:p>
         </w:tc>
@@ -4273,6 +4273,562 @@
         <w:spacing w:after="140"/>
       </w:pPr>
       <w:r>
+        <w:t xml:space="preserve">3h. COMMERCIAL PACKAGING STATUS, VERIFIED 2026-08-14 (rev 6)</w:t>
+      </w:r>
+    </w:p>
+    <w:p>
+      <w:pPr>
+        <w:spacing w:after="140"/>
+      </w:pPr>
+      <w:r>
+        <w:rPr>
+          <w:b/>
+        </w:rPr>
+        <w:t xml:space="preserve">All four directives verified against disk and production rather than re-run.</w:t>
+      </w:r>
+      <w:r>
+        <w:t xml:space="preserve"> Nothing needed repair.</w:t>
+      </w:r>
+    </w:p>
+    <w:tbl>
+      <w:tblPr>
+        <w:tblStyle w:val="TableGrid"/>
+        <w:tblW w:w="9360" w:type="dxa"/>
+        <w:tblBorders>
+          <w:top w:val="single" w:sz="4" w:space="0" w:color="999999"/>
+          <w:left w:val="single" w:sz="4" w:space="0" w:color="999999"/>
+          <w:bottom w:val="single" w:sz="4" w:space="0" w:color="999999"/>
+          <w:right w:val="single" w:sz="4" w:space="0" w:color="999999"/>
+          <w:insideH w:val="single" w:sz="4" w:space="0" w:color="999999"/>
+          <w:insideV w:val="single" w:sz="4" w:space="0" w:color="999999"/>
+        </w:tblBorders>
+      </w:tblPr>
+      <w:tblGrid>
+        <w:gridCol w:w="4680"/>
+        <w:gridCol w:w="4680"/>
+      </w:tblGrid>
+      <w:tr>
+        <w:tc>
+          <w:tcPr>
+            <w:tcW w:w="4680" w:type="dxa"/>
+          </w:tcPr>
+          <w:p>
+            <w:pPr>
+              <w:spacing w:after="0"/>
+            </w:pPr>
+            <w:r>
+              <w:t xml:space="preserve">Directive</w:t>
+            </w:r>
+          </w:p>
+        </w:tc>
+        <w:tc>
+          <w:tcPr>
+            <w:tcW w:w="4680" w:type="dxa"/>
+          </w:tcPr>
+          <w:p>
+            <w:pPr>
+              <w:spacing w:after="0"/>
+            </w:pPr>
+            <w:r>
+              <w:t xml:space="preserve">Evidence</w:t>
+            </w:r>
+          </w:p>
+        </w:tc>
+      </w:tr>
+      <w:tr>
+        <w:tc>
+          <w:tcPr>
+            <w:tcW w:w="4680" w:type="dxa"/>
+          </w:tcPr>
+          <w:p>
+            <w:pPr>
+              <w:spacing w:after="0"/>
+            </w:pPr>
+            <w:r>
+              <w:t xml:space="preserve">Completer pivot enforced</w:t>
+            </w:r>
+          </w:p>
+        </w:tc>
+        <w:tc>
+          <w:tcPr>
+            <w:tcW w:w="4680" w:type="dxa"/>
+          </w:tcPr>
+          <w:p>
+            <w:pPr>
+              <w:spacing w:after="0"/>
+            </w:pPr>
+            <w:r>
+              <w:rPr>
+                <w:b/>
+              </w:rPr>
+              <w:t xml:space="preserve">0 files</w:t>
+            </w:r>
+            <w:r>
+              <w:t xml:space="preserve"> carry any of the six free-grant phrases outside the trackers that record their removal and the test that guards against their return. </w:t>
+            </w:r>
+            <w:r>
+              <w:rPr>
+                <w:b/>
+              </w:rPr>
+              <w:t xml:space="preserve">36 of 36</w:t>
+            </w:r>
+            <w:r>
+              <w:t xml:space="preserve"> messages carry the Award Citation and the Registry ID</w:t>
+            </w:r>
+          </w:p>
+        </w:tc>
+      </w:tr>
+      <w:tr>
+        <w:tc>
+          <w:tcPr>
+            <w:tcW w:w="4680" w:type="dxa"/>
+          </w:tcPr>
+          <w:p>
+            <w:pPr>
+              <w:spacing w:after="0"/>
+            </w:pPr>
+            <w:r>
+              <w:t xml:space="preserve">Batch payloads regenerated</w:t>
+            </w:r>
+          </w:p>
+        </w:tc>
+        <w:tc>
+          <w:tcPr>
+            <w:tcW w:w="4680" w:type="dxa"/>
+          </w:tcPr>
+          <w:p>
+            <w:pPr>
+              <w:spacing w:after="0"/>
+            </w:pPr>
+            <w:r>
+              <w:t xml:space="preserve">36 files, 16 Arm A + 20 Arm B, </w:t>
+            </w:r>
+            <w:r>
+              <w:rPr>
+                <w:b/>
+              </w:rPr>
+              <w:t xml:space="preserve">0 missing keys</w:t>
+            </w:r>
+            <w:r>
+              <w:t xml:space="preserve">, all 36 carry the deadline. Honors span </w:t>
+            </w:r>
+            <w:r>
+              <w:rPr>
+                <w:b/>
+              </w:rPr>
+              <w:t xml:space="preserve">H-2026-02 to H-2026-37</w:t>
+            </w:r>
+            <w:r>
+              <w:t xml:space="preserve"> with </w:t>
+            </w:r>
+            <w:r>
+              <w:rPr>
+                <w:b/>
+              </w:rPr>
+              <w:t xml:space="preserve">no completer left without one</w:t>
+            </w:r>
+          </w:p>
+        </w:tc>
+      </w:tr>
+      <w:tr>
+        <w:tc>
+          <w:tcPr>
+            <w:tcW w:w="4680" w:type="dxa"/>
+          </w:tcPr>
+          <w:p>
+            <w:pPr>
+              <w:spacing w:after="0"/>
+            </w:pPr>
+            <w:r>
+              <w:t xml:space="preserve">Monetization paths intact</w:t>
+            </w:r>
+          </w:p>
+        </w:tc>
+        <w:tc>
+          <w:tcPr>
+            <w:tcW w:w="4680" w:type="dxa"/>
+          </w:tcPr>
+          <w:p>
+            <w:pPr>
+              <w:spacing w:after="0"/>
+            </w:pPr>
+            <w:r>
+              <w:t xml:space="preserve">Live: </w:t>
+            </w:r>
+            <w:r>
+              <w:rPr>
+                <w:rFonts w:ascii="Consolas" w:hAnsi="Consolas"/>
+              </w:rPr>
+              <w:t xml:space="preserve">audit</w:t>
+            </w:r>
+            <w:r>
+              <w:t xml:space="preserve"> 503 fail-safe / </w:t>
+            </w:r>
+            <w:r>
+              <w:rPr>
+                <w:rFonts w:ascii="Consolas" w:hAnsi="Consolas"/>
+              </w:rPr>
+              <w:t xml:space="preserve">$250</w:t>
+            </w:r>
+            <w:r>
+              <w:t xml:space="preserve">, </w:t>
+            </w:r>
+            <w:r>
+              <w:rPr>
+                <w:rFonts w:ascii="Consolas" w:hAnsi="Consolas"/>
+              </w:rPr>
+              <w:t xml:space="preserve">governance</w:t>
+            </w:r>
+            <w:r>
+              <w:t xml:space="preserve"> 503 / </w:t>
+            </w:r>
+            <w:r>
+              <w:rPr>
+                <w:rFonts w:ascii="Consolas" w:hAnsi="Consolas"/>
+              </w:rPr>
+              <w:t xml:space="preserve">$500</w:t>
+            </w:r>
+            <w:r>
+              <w:t xml:space="preserve">, </w:t>
+            </w:r>
+            <w:r>
+              <w:rPr>
+                <w:rFonts w:ascii="Consolas" w:hAnsi="Consolas"/>
+              </w:rPr>
+              <w:t xml:space="preserve">calibration</w:t>
+            </w:r>
+            <w:r>
+              <w:t xml:space="preserve"> 503 / </w:t>
+            </w:r>
+            <w:r>
+              <w:rPr>
+                <w:rFonts w:ascii="Consolas" w:hAnsi="Consolas"/>
+              </w:rPr>
+              <w:t xml:space="preserve">$750</w:t>
+            </w:r>
+            <w:r>
+              <w:t xml:space="preserve">, unknown offer 404, </w:t>
+            </w:r>
+            <w:r>
+              <w:rPr>
+                <w:b/>
+              </w:rPr>
+              <w:t xml:space="preserve">zero Location headers on an unconfigured offer</w:t>
+            </w:r>
+          </w:p>
+        </w:tc>
+      </w:tr>
+      <w:tr>
+        <w:tc>
+          <w:tcPr>
+            <w:tcW w:w="4680" w:type="dxa"/>
+          </w:tcPr>
+          <w:p>
+            <w:pPr>
+              <w:spacing w:after="0"/>
+            </w:pPr>
+            <w:r>
+              <w:t xml:space="preserve">System integrity</w:t>
+            </w:r>
+          </w:p>
+        </w:tc>
+        <w:tc>
+          <w:tcPr>
+            <w:tcW w:w="4680" w:type="dxa"/>
+          </w:tcPr>
+          <w:p>
+            <w:pPr>
+              <w:spacing w:after="0"/>
+            </w:pPr>
+            <w:r>
+              <w:rPr>
+                <w:b/>
+              </w:rPr>
+              <w:t xml:space="preserve">69 assertions across 5 suites, all passing.</w:t>
+            </w:r>
+            <w:r>
+              <w:t xml:space="preserve"> Guard 12 of 12. </w:t>
+            </w:r>
+            <w:r>
+              <w:rPr>
+                <w:b/>
+              </w:rPr>
+              <w:t xml:space="preserve">0 of 11</w:t>
+            </w:r>
+            <w:r>
+              <w:t xml:space="preserve"> prohibited claims across every HTML, JS and JSON file</w:t>
+            </w:r>
+          </w:p>
+        </w:tc>
+      </w:tr>
+    </w:tbl>
+    <w:p>
+      <w:pPr/>
+      <w:r>
+        <w:t/>
+      </w:r>
+    </w:p>
+    <w:p>
+      <w:pPr>
+        <w:spacing w:after="140"/>
+      </w:pPr>
+      <w:r>
+        <w:rPr>
+          <w:b/>
+        </w:rPr>
+        <w:t xml:space="preserve">Regeneration produced no diff</w:t>
+      </w:r>
+      <w:r>
+        <w:t xml:space="preserve">, which is the property that matters: the generator is deterministic from its sources, so running it again cannot quietly change what 36 people are sent.</w:t>
+      </w:r>
+    </w:p>
+    <w:p>
+      <w:pPr>
+        <w:pStyle w:val="Heading3"/>
+        <w:spacing w:after="140"/>
+      </w:pPr>
+      <w:r>
+        <w:t xml:space="preserve">Security constraints re-confirmed</w:t>
+      </w:r>
+    </w:p>
+    <w:tbl>
+      <w:tblPr>
+        <w:tblStyle w:val="TableGrid"/>
+        <w:tblW w:w="9360" w:type="dxa"/>
+        <w:tblBorders>
+          <w:top w:val="single" w:sz="4" w:space="0" w:color="999999"/>
+          <w:left w:val="single" w:sz="4" w:space="0" w:color="999999"/>
+          <w:bottom w:val="single" w:sz="4" w:space="0" w:color="999999"/>
+          <w:right w:val="single" w:sz="4" w:space="0" w:color="999999"/>
+          <w:insideH w:val="single" w:sz="4" w:space="0" w:color="999999"/>
+          <w:insideV w:val="single" w:sz="4" w:space="0" w:color="999999"/>
+        </w:tblBorders>
+      </w:tblPr>
+      <w:tblGrid>
+        <w:gridCol w:w="4680"/>
+        <w:gridCol w:w="4680"/>
+      </w:tblGrid>
+      <w:tr>
+        <w:tc>
+          <w:tcPr>
+            <w:tcW w:w="4680" w:type="dxa"/>
+          </w:tcPr>
+          <w:p>
+            <w:pPr>
+              <w:spacing w:after="0"/>
+            </w:pPr>
+            <w:r>
+              <w:rPr>
+                <w:rFonts w:ascii="Consolas" w:hAnsi="Consolas"/>
+              </w:rPr>
+              <w:t xml:space="preserve">/api/bench-score</w:t>
+            </w:r>
+            <w:r>
+              <w:t xml:space="preserve"> without a licence</w:t>
+            </w:r>
+          </w:p>
+        </w:tc>
+        <w:tc>
+          <w:tcPr>
+            <w:tcW w:w="4680" w:type="dxa"/>
+          </w:tcPr>
+          <w:p>
+            <w:pPr>
+              <w:spacing w:after="0"/>
+            </w:pPr>
+            <w:r>
+              <w:rPr>
+                <w:b/>
+              </w:rPr>
+              <w:t xml:space="preserve">503 `licensing_not_provisioned`</w:t>
+            </w:r>
+          </w:p>
+        </w:tc>
+      </w:tr>
+      <w:tr>
+        <w:tc>
+          <w:tcPr>
+            <w:tcW w:w="4680" w:type="dxa"/>
+          </w:tcPr>
+          <w:p>
+            <w:pPr>
+              <w:spacing w:after="0"/>
+            </w:pPr>
+            <w:r>
+              <w:t xml:space="preserve">Key, per-record results or condition logic in any response</w:t>
+            </w:r>
+          </w:p>
+        </w:tc>
+        <w:tc>
+          <w:tcPr>
+            <w:tcW w:w="4680" w:type="dxa"/>
+          </w:tcPr>
+          <w:p>
+            <w:pPr>
+              <w:spacing w:after="0"/>
+            </w:pPr>
+            <w:r>
+              <w:rPr>
+                <w:b/>
+              </w:rPr>
+              <w:t xml:space="preserve">none</w:t>
+            </w:r>
+            <w:r>
+              <w:t xml:space="preserve">, by construction</w:t>
+            </w:r>
+          </w:p>
+        </w:tc>
+      </w:tr>
+      <w:tr>
+        <w:tc>
+          <w:tcPr>
+            <w:tcW w:w="4680" w:type="dxa"/>
+          </w:tcPr>
+          <w:p>
+            <w:pPr>
+              <w:spacing w:after="0"/>
+            </w:pPr>
+            <w:r>
+              <w:t xml:space="preserve">Routes storing submitted record text</w:t>
+            </w:r>
+          </w:p>
+        </w:tc>
+        <w:tc>
+          <w:tcPr>
+            <w:tcW w:w="4680" w:type="dxa"/>
+          </w:tcPr>
+          <w:p>
+            <w:pPr>
+              <w:spacing w:after="0"/>
+            </w:pPr>
+            <w:r>
+              <w:rPr>
+                <w:b/>
+              </w:rPr>
+              <w:t xml:space="preserve">zero.</w:t>
+            </w:r>
+            <w:r>
+              <w:t xml:space="preserve"> Every remaining mention is a comment recording the removal</w:t>
+            </w:r>
+          </w:p>
+        </w:tc>
+      </w:tr>
+      <w:tr>
+        <w:tc>
+          <w:tcPr>
+            <w:tcW w:w="4680" w:type="dxa"/>
+          </w:tcPr>
+          <w:p>
+            <w:pPr>
+              <w:spacing w:after="0"/>
+            </w:pPr>
+            <w:r>
+              <w:rPr>
+                <w:rFonts w:ascii="Consolas" w:hAnsi="Consolas"/>
+              </w:rPr>
+              <w:t xml:space="preserve">/api/checkout</w:t>
+            </w:r>
+            <w:r>
+              <w:t xml:space="preserve"> on an unconfigured offer</w:t>
+            </w:r>
+          </w:p>
+        </w:tc>
+        <w:tc>
+          <w:tcPr>
+            <w:tcW w:w="4680" w:type="dxa"/>
+          </w:tcPr>
+          <w:p>
+            <w:pPr>
+              <w:spacing w:after="0"/>
+            </w:pPr>
+            <w:r>
+              <w:rPr>
+                <w:b/>
+              </w:rPr>
+              <w:t xml:space="preserve">503 with the price and an invoice path. No redirect, no guessed destination</w:t>
+            </w:r>
+          </w:p>
+        </w:tc>
+      </w:tr>
+    </w:tbl>
+    <w:p>
+      <w:pPr/>
+      <w:r>
+        <w:t/>
+      </w:r>
+    </w:p>
+    <w:p>
+      <w:pPr>
+        <w:pStyle w:val="Heading3"/>
+        <w:spacing w:after="140"/>
+      </w:pPr>
+      <w:r>
+        <w:t xml:space="preserve">Adversarial validation</w:t>
+      </w:r>
+    </w:p>
+    <w:p>
+      <w:pPr>
+        <w:spacing w:after="140"/>
+      </w:pPr>
+      <w:r>
+        <w:rPr>
+          <w:rFonts w:ascii="Consolas" w:hAnsi="Consolas"/>
+        </w:rPr>
+        <w:t xml:space="preserve">OFFER_TOTAL_LEGACY = 3</w:t>
+      </w:r>
+      <w:r>
+        <w:t xml:space="preserve"> injected into </w:t>
+      </w:r>
+      <w:r>
+        <w:rPr>
+          <w:rFonts w:ascii="Consolas" w:hAnsi="Consolas"/>
+        </w:rPr>
+        <w:t xml:space="preserve">api/checkout.js</w:t>
+      </w:r>
+      <w:r>
+        <w:t xml:space="preserve">: </w:t>
+      </w:r>
+      <w:r>
+        <w:rPr>
+          <w:b/>
+        </w:rPr>
+        <w:t xml:space="preserve">caught, exit 1</w:t>
+      </w:r>
+      <w:r>
+        <w:t xml:space="preserve">. Reverted: </w:t>
+      </w:r>
+      <w:r>
+        <w:rPr>
+          <w:b/>
+        </w:rPr>
+        <w:t xml:space="preserve">8 of 8, exit 0</w:t>
+      </w:r>
+      <w:r>
+        <w:t xml:space="preserve">. Hook runs in </w:t>
+      </w:r>
+      <w:r>
+        <w:rPr>
+          <w:b/>
+        </w:rPr>
+        <w:t xml:space="preserve">0.19s</w:t>
+      </w:r>
+      <w:r>
+        <w:t xml:space="preserve">.</w:t>
+      </w:r>
+    </w:p>
+    <w:p>
+      <w:pPr>
+        <w:pBdr>
+          <w:bottom w:val="single" w:sz="6" w:space="1" w:color="AAAAAA"/>
+        </w:pBdr>
+      </w:pPr>
+    </w:p>
+    <w:p>
+      <w:pPr>
+        <w:pStyle w:val="Heading2"/>
+        <w:spacing w:after="140"/>
+      </w:pPr>
+      <w:r>
         <w:t xml:space="preserve">4. LIVE BASELINE, THE NUMBERS EVERY PACKAGE INHERITS</w:t>
       </w:r>
     </w:p>
@@ -5571,6 +6127,53 @@
             </w:pPr>
             <w:r>
               <w:t xml:space="preserve">Change</w:t>
+            </w:r>
+          </w:p>
+        </w:tc>
+      </w:tr>
+      <w:tr>
+        <w:tc>
+          <w:tcPr>
+            <w:tcW w:w="3120" w:type="dxa"/>
+          </w:tcPr>
+          <w:p>
+            <w:pPr>
+              <w:spacing w:after="0"/>
+            </w:pPr>
+            <w:r>
+              <w:t xml:space="preserve">6</w:t>
+            </w:r>
+          </w:p>
+        </w:tc>
+        <w:tc>
+          <w:tcPr>
+            <w:tcW w:w="3120" w:type="dxa"/>
+          </w:tcPr>
+          <w:p>
+            <w:pPr>
+              <w:spacing w:after="0"/>
+            </w:pPr>
+            <w:r>
+              <w:t xml:space="preserve">2026-08-14</w:t>
+            </w:r>
+          </w:p>
+        </w:tc>
+        <w:tc>
+          <w:tcPr>
+            <w:tcW w:w="3120" w:type="dxa"/>
+          </w:tcPr>
+          <w:p>
+            <w:pPr>
+              <w:spacing w:after="0"/>
+            </w:pPr>
+            <w:r>
+              <w:rPr>
+                <w:b/>
+              </w:rPr>
+              <w:t xml:space="preserve">Commercial packaging verified active, not re-run.</w:t>
+            </w:r>
+            <w:r>
+              <w:t xml:space="preserve"> All four directives checked against disk and production: 0 free-grant phrases in any sendable or live surface, 36 of 36 messages carrying the Award Citation and Registry ID, honors spanning H-2026-02 to H-2026-37 with every completer covered, all three paid tiers routing correctly with a 503 fail-safe and no Location header, and 69 assertions across 5 suites passing with 0 of 11 prohibited claims repo-wide. Regeneration produced no diff, confirming the generator is deterministic. New section 3h.</w:t>
             </w:r>
           </w:p>
         </w:tc>

</xml_diff>